<commit_message>
Add private imaging archive and update paid service documents
</commit_message>
<xml_diff>
--- a/public/images/documents/pravila-predostavleniya-platnyh-medicinskih-uslug.docx
+++ b/public/images/documents/pravila-predostavleniya-platnyh-medicinskih-uslug.docx
@@ -93,9 +93,6 @@
         <w:t xml:space="preserve"> Настоящие «Правила, порядки, условия, формы оказания медицинских услуг и их оплаты» (далее по тексту – Правила) определяют правила, порядки, условия, формы оказания медицинских услуг и их оплату в ООО «</w:t>
       </w:r>
       <w:r>
-        <w:rPr>
-          <w:rStyle w:val="FontStyle46"/>
-        </w:rPr>
         <w:t>Альтамед-С</w:t>
       </w:r>
       <w:r>
@@ -111,7 +108,12 @@
         <w:jc w:val="both"/>
       </w:pPr>
       <w:r>
-        <w:t xml:space="preserve">Настоящие Правила разработано в соответствии с Гражданским кодексом РФ, законом «О защите прав потребителей», Правилами предоставления медицинскими организациями платных медицинских услуг (ППРФ от </w:t>
+        <w:t>Настоящие Правила разработано в соответствии с Гражданским кодексом РФ, законом «О защите прав потребителей», Правилами предост</w:t>
+      </w:r>
+      <w:bookmarkStart w:id="0" w:name="_GoBack"/>
+      <w:bookmarkEnd w:id="0"/>
+      <w:r>
+        <w:t xml:space="preserve">авления медицинскими организациями платных медицинских услуг (ППРФ от </w:t>
       </w:r>
       <w:r>
         <w:t>30</w:t>
@@ -1071,15 +1073,7 @@
         <w:t xml:space="preserve">и оказания услуги </w:t>
       </w:r>
       <w:r>
-        <w:t xml:space="preserve">пациент оплачивает в </w:t>
-      </w:r>
-      <w:bookmarkStart w:id="0" w:name="_GoBack"/>
-      <w:r>
-        <w:t xml:space="preserve">регистратуре стоимость платных медицинских услуг. Оплата за услуги врачу не </w:t>
-      </w:r>
-      <w:bookmarkEnd w:id="0"/>
-      <w:r>
-        <w:t xml:space="preserve">допускается. </w:t>
+        <w:t xml:space="preserve">пациент оплачивает в регистратуре стоимость платных медицинских услуг. Оплата за услуги врачу не допускается. </w:t>
       </w:r>
       <w:r>
         <w:t>В случае недостаточности у Пациента денежных средств для опла</w:t>

</xml_diff>